<commit_message>
feat: Use environment variables for configuration 1. Update docker-compose.yml to use environment variables 2. Update db.php to use environment variables for database connection
</commit_message>
<xml_diff>
--- a/docs/AWS_第11組_期末作品企劃書.docx
+++ b/docs/AWS_第11組_期末作品企劃書.docx
@@ -15,14 +15,7 @@
           <w:rFonts w:ascii="標楷體" w:eastAsia="標楷體" w:hAnsi="標楷體" w:cs="Microsoft JhengHei UI" w:hint="eastAsia"/>
           <w:sz w:val="42"/>
         </w:rPr>
-        <w:t>雲端服務架構實務</w:t>
-      </w:r>
-      <w:r>
-        <w:rPr>
-          <w:rFonts w:ascii="標楷體" w:eastAsia="標楷體" w:hAnsi="標楷體" w:cs="Microsoft JhengHei UI" w:hint="eastAsia"/>
-          <w:sz w:val="42"/>
-        </w:rPr>
-        <w:t xml:space="preserve"> -</w:t>
+        <w:t>雲端服務架構實務 -</w:t>
       </w:r>
       <w:r>
         <w:rPr>
@@ -320,7 +313,7 @@
         <w:spacing w:before="240"/>
         <w:ind w:leftChars="0"/>
         <w:rPr>
-          <w:rFonts w:ascii="標楷體" w:eastAsia="標楷體" w:hAnsi="標楷體" w:hint="eastAsia"/>
+          <w:rFonts w:ascii="標楷體" w:eastAsia="標楷體" w:hAnsi="標楷體"/>
           <w:sz w:val="24"/>
           <w:szCs w:val="24"/>
         </w:rPr>
@@ -429,7 +422,7 @@
         <w:spacing w:before="240" w:after="105"/>
         <w:ind w:leftChars="0" w:left="479"/>
         <w:rPr>
-          <w:rFonts w:ascii="標楷體" w:eastAsia="標楷體" w:hAnsi="標楷體" w:hint="eastAsia"/>
+          <w:rFonts w:ascii="標楷體" w:eastAsia="標楷體" w:hAnsi="標楷體"/>
           <w:sz w:val="24"/>
           <w:szCs w:val="24"/>
         </w:rPr>
@@ -1153,7 +1146,7 @@
         <w:spacing w:before="240" w:after="91" w:line="265" w:lineRule="auto"/>
         <w:ind w:leftChars="0" w:right="133"/>
         <w:rPr>
-          <w:rFonts w:ascii="標楷體" w:eastAsia="標楷體" w:hAnsi="標楷體" w:hint="eastAsia"/>
+          <w:rFonts w:ascii="標楷體" w:eastAsia="標楷體" w:hAnsi="標楷體"/>
           <w:sz w:val="24"/>
           <w:szCs w:val="24"/>
         </w:rPr>
@@ -1612,15 +1605,7 @@
           <w:sz w:val="24"/>
           <w:szCs w:val="24"/>
         </w:rPr>
-        <w:t xml:space="preserve"> </w:t>
-      </w:r>
-      <w:r>
-        <w:rPr>
-          <w:rFonts w:ascii="標楷體" w:eastAsia="標楷體" w:hAnsi="標楷體" w:hint="eastAsia"/>
-          <w:sz w:val="24"/>
-          <w:szCs w:val="24"/>
-        </w:rPr>
-        <w:t>讀取配置。</w:t>
+        <w:t xml:space="preserve"> 讀取配置。</w:t>
       </w:r>
     </w:p>
     <w:p>
@@ -1705,7 +1690,7 @@
         <w:spacing w:before="240" w:after="89"/>
         <w:ind w:leftChars="0" w:right="103"/>
         <w:rPr>
-          <w:rFonts w:ascii="標楷體" w:eastAsia="標楷體" w:hAnsi="標楷體" w:hint="eastAsia"/>
+          <w:rFonts w:ascii="標楷體" w:eastAsia="標楷體" w:hAnsi="標楷體"/>
           <w:sz w:val="24"/>
           <w:szCs w:val="24"/>
         </w:rPr>
@@ -1781,6 +1766,24 @@
           <w:szCs w:val="24"/>
         </w:rPr>
         <w:t>權限不外流。</w:t>
+      </w:r>
+    </w:p>
+    <w:p>
+      <w:pPr>
+        <w:spacing w:after="0" w:line="240" w:lineRule="auto"/>
+        <w:rPr>
+          <w:rFonts w:ascii="標楷體" w:eastAsia="標楷體" w:hAnsi="標楷體" w:hint="eastAsia"/>
+          <w:sz w:val="24"/>
+          <w:szCs w:val="24"/>
+        </w:rPr>
+      </w:pPr>
+      <w:r>
+        <w:rPr>
+          <w:rFonts w:ascii="標楷體" w:eastAsia="標楷體" w:hAnsi="標楷體"/>
+          <w:sz w:val="24"/>
+          <w:szCs w:val="24"/>
+        </w:rPr>
+        <w:br w:type="page"/>
       </w:r>
     </w:p>
     <w:p>
@@ -1800,19 +1803,54 @@
       </w:pPr>
       <w:r>
         <w:rPr>
-          <w:rFonts w:ascii="標楷體" w:eastAsia="標楷體" w:hAnsi="標楷體"/>
+          <w:rFonts w:ascii="標楷體" w:eastAsia="標楷體" w:hAnsi="標楷體" w:cs="Microsoft JhengHei UI"/>
+          <w:sz w:val="28"/>
+          <w:szCs w:val="28"/>
+        </w:rPr>
+        <w:lastRenderedPageBreak/>
+        <w:t>雲架</w:t>
+      </w:r>
+      <w:r>
+        <w:rPr>
+          <w:rFonts w:ascii="標楷體" w:eastAsia="標楷體" w:hAnsi="標楷體" w:cs="Microsoft JhengHei UI" w:hint="eastAsia"/>
+          <w:sz w:val="28"/>
+          <w:szCs w:val="28"/>
+        </w:rPr>
+        <w:t>構示</w:t>
+      </w:r>
+      <w:r>
+        <w:rPr>
+          <w:rFonts w:ascii="標楷體" w:eastAsia="標楷體" w:hAnsi="標楷體" w:cs="標楷體" w:hint="eastAsia"/>
+          <w:sz w:val="28"/>
+          <w:szCs w:val="28"/>
+        </w:rPr>
+        <w:t>意圖</w:t>
+      </w:r>
+    </w:p>
+    <w:p>
+      <w:pPr>
+        <w:spacing w:before="240" w:after="282"/>
+        <w:ind w:left="104"/>
+        <w:rPr>
+          <w:rFonts w:ascii="標楷體" w:eastAsia="標楷體" w:hAnsi="標楷體"/>
+        </w:rPr>
+      </w:pPr>
+      <w:r>
+        <w:rPr>
+          <w:rFonts w:ascii="標楷體" w:eastAsia="標楷體" w:hAnsi="標楷體"/>
+          <w:noProof/>
         </w:rPr>
         <w:drawing>
-          <wp:anchor distT="0" distB="0" distL="114300" distR="114300" simplePos="0" relativeHeight="251658240" behindDoc="1" locked="0" layoutInCell="1" allowOverlap="1" wp14:anchorId="675FB17D" wp14:editId="0EC864B6">
+          <wp:anchor distT="0" distB="0" distL="114300" distR="114300" simplePos="0" relativeHeight="251658240" behindDoc="1" locked="0" layoutInCell="1" allowOverlap="1" wp14:anchorId="675FB17D" wp14:editId="5A97C454">
             <wp:simplePos x="0" y="0"/>
             <wp:positionH relativeFrom="margin">
               <wp:align>center</wp:align>
             </wp:positionH>
             <wp:positionV relativeFrom="paragraph">
-              <wp:posOffset>102235</wp:posOffset>
+              <wp:posOffset>143841</wp:posOffset>
             </wp:positionV>
-            <wp:extent cx="3728804" cy="4098986"/>
-            <wp:effectExtent l="0" t="0" r="5080" b="0"/>
+            <wp:extent cx="4498238" cy="4944808"/>
+            <wp:effectExtent l="0" t="0" r="0" b="8255"/>
             <wp:wrapNone/>
             <wp:docPr id="1" name="圖片 1"/>
             <wp:cNvGraphicFramePr>
@@ -1840,7 +1878,7 @@
                   <pic:spPr>
                     <a:xfrm>
                       <a:off x="0" y="0"/>
-                      <a:ext cx="3728804" cy="4098986"/>
+                      <a:ext cx="4498238" cy="4944808"/>
                     </a:xfrm>
                     <a:prstGeom prst="rect">
                       <a:avLst/>
@@ -1858,39 +1896,6 @@
           </wp:anchor>
         </w:drawing>
       </w:r>
-      <w:r>
-        <w:rPr>
-          <w:rFonts w:ascii="標楷體" w:eastAsia="標楷體" w:hAnsi="標楷體" w:cs="Microsoft JhengHei UI"/>
-          <w:sz w:val="28"/>
-          <w:szCs w:val="28"/>
-        </w:rPr>
-        <w:t>雲架</w:t>
-      </w:r>
-      <w:r>
-        <w:rPr>
-          <w:rFonts w:ascii="標楷體" w:eastAsia="標楷體" w:hAnsi="標楷體" w:cs="Microsoft JhengHei UI" w:hint="eastAsia"/>
-          <w:sz w:val="28"/>
-          <w:szCs w:val="28"/>
-        </w:rPr>
-        <w:t>構示</w:t>
-      </w:r>
-      <w:r>
-        <w:rPr>
-          <w:rFonts w:ascii="標楷體" w:eastAsia="標楷體" w:hAnsi="標楷體" w:cs="標楷體" w:hint="eastAsia"/>
-          <w:sz w:val="28"/>
-          <w:szCs w:val="28"/>
-        </w:rPr>
-        <w:t>意圖</w:t>
-      </w:r>
-    </w:p>
-    <w:p>
-      <w:pPr>
-        <w:spacing w:before="240" w:after="282"/>
-        <w:ind w:left="104"/>
-        <w:rPr>
-          <w:rFonts w:ascii="標楷體" w:eastAsia="標楷體" w:hAnsi="標楷體" w:hint="eastAsia"/>
-        </w:rPr>
-      </w:pPr>
       <w:r>
         <w:rPr>
           <w:rFonts w:ascii="標楷體" w:eastAsia="標楷體" w:hAnsi="標楷體"/>

</xml_diff>